<commit_message>
docs: overhaul Chapter 12 user manual per InterviewerAI format, update screenshots with live mock data, format Chapter 5, 9, 10 docs
</commit_message>
<xml_diff>
--- a/Uban System Documents/章節性文件/Chapter 5.docx
+++ b/Uban System Documents/章節性文件/Chapter 5.docx
@@ -239,6 +239,7 @@
         <w:tc>
           <w:tcPr>
             <w:tcW w:type="dxa" w:w="1440"/>
+            <w:vMerge w:val="restart"/>
             <w:shd w:fill="FFFFFF"/>
             <w:tcMar>
               <w:top w:w="50" w:type="dxa"/>
@@ -247,7 +248,360 @@
               <w:right w:w="90" w:type="dxa"/>
             </w:tcMar>
             <w:vAlign w:val="center"/>
-          </w:tcPr>
+            <w:shd w:fill="F2F5F9"/>
+            <w:tcMar>
+              <w:top w:w="60" w:type="dxa"/>
+              <w:bottom w:w="60" w:type="dxa"/>
+              <w:left w:w="90" w:type="dxa"/>
+              <w:right w:w="90" w:type="dxa"/>
+            </w:tcMar>
+          </w:tcPr>
+          <w:p>
+            <w:pPr>
+              <w:spacing w:before="0" w:after="0" w:lineRule="exact" w:line="360"/>
+              <w:jc w:val="center"/>
+            </w:pPr>
+            <w:r/>
+            <w:r>
+              <w:rPr>
+                <w:rFonts w:ascii="Times New Roman" w:hAnsi="Times New Roman" w:eastAsia="標楷體"/>
+                <w:b/>
+                <w:color w:val="142850"/>
+                <w:sz w:val="24"/>
+              </w:rPr>
+              <w:t>長輩</w:t>
+            </w:r>
+          </w:p>
+          <w:p>
+            <w:pPr>
+              <w:spacing w:before="0" w:after="0" w:lineRule="exact" w:line="360"/>
+              <w:jc w:val="center"/>
+            </w:pPr>
+            <w:r>
+              <w:rPr>
+                <w:rFonts w:ascii="Times New Roman" w:hAnsi="Times New Roman" w:eastAsia="標楷體"/>
+                <w:b/>
+                <w:color w:val="282828"/>
+                <w:sz w:val="24"/>
+              </w:rPr>
+              <w:t>長輩</w:t>
+            </w:r>
+          </w:p>
+          <w:p>
+            <w:pPr>
+              <w:spacing w:before="0" w:after="0" w:lineRule="exact" w:line="360"/>
+              <w:jc w:val="center"/>
+            </w:pPr>
+            <w:r>
+              <w:rPr>
+                <w:rFonts w:ascii="Times New Roman" w:hAnsi="Times New Roman" w:eastAsia="標楷體"/>
+                <w:b/>
+                <w:color w:val="282828"/>
+                <w:sz w:val="24"/>
+              </w:rPr>
+              <w:t>長輩</w:t>
+            </w:r>
+          </w:p>
+          <w:p>
+            <w:pPr>
+              <w:spacing w:before="0" w:after="0" w:lineRule="exact" w:line="360"/>
+              <w:jc w:val="center"/>
+            </w:pPr>
+            <w:r>
+              <w:rPr>
+                <w:rFonts w:ascii="Times New Roman" w:hAnsi="Times New Roman" w:eastAsia="標楷體"/>
+                <w:b/>
+                <w:color w:val="282828"/>
+                <w:sz w:val="24"/>
+              </w:rPr>
+              <w:t>長輩</w:t>
+            </w:r>
+          </w:p>
+          <w:p>
+            <w:pPr>
+              <w:spacing w:before="0" w:after="0" w:lineRule="exact" w:line="360"/>
+              <w:jc w:val="center"/>
+            </w:pPr>
+            <w:r>
+              <w:rPr>
+                <w:rFonts w:ascii="Times New Roman" w:hAnsi="Times New Roman" w:eastAsia="標楷體"/>
+                <w:b/>
+                <w:color w:val="282828"/>
+                <w:sz w:val="24"/>
+              </w:rPr>
+              <w:t>長輩</w:t>
+            </w:r>
+          </w:p>
+          <w:p>
+            <w:pPr>
+              <w:spacing w:before="0" w:after="0" w:lineRule="exact" w:line="360"/>
+              <w:jc w:val="center"/>
+            </w:pPr>
+            <w:r>
+              <w:rPr>
+                <w:rFonts w:ascii="Times New Roman" w:hAnsi="Times New Roman" w:eastAsia="標楷體"/>
+                <w:b/>
+                <w:color w:val="282828"/>
+                <w:sz w:val="24"/>
+              </w:rPr>
+              <w:t>長輩</w:t>
+            </w:r>
+          </w:p>
+          <w:p>
+            <w:pPr>
+              <w:spacing w:before="0" w:after="0" w:lineRule="exact" w:line="360"/>
+              <w:jc w:val="center"/>
+            </w:pPr>
+            <w:r>
+              <w:rPr>
+                <w:rFonts w:ascii="Times New Roman" w:hAnsi="Times New Roman" w:eastAsia="標楷體"/>
+                <w:b/>
+                <w:color w:val="282828"/>
+                <w:sz w:val="24"/>
+              </w:rPr>
+              <w:t>長輩</w:t>
+            </w:r>
+          </w:p>
+          <w:p>
+            <w:pPr>
+              <w:spacing w:before="0" w:after="0" w:lineRule="exact" w:line="360"/>
+              <w:jc w:val="center"/>
+            </w:pPr>
+            <w:r>
+              <w:rPr>
+                <w:rFonts w:ascii="Times New Roman" w:hAnsi="Times New Roman" w:eastAsia="標楷體"/>
+                <w:b/>
+                <w:color w:val="282828"/>
+                <w:sz w:val="24"/>
+              </w:rPr>
+              <w:t>長輩</w:t>
+            </w:r>
+          </w:p>
+          <w:p>
+            <w:pPr>
+              <w:spacing w:before="0" w:after="0" w:lineRule="exact" w:line="360"/>
+              <w:jc w:val="center"/>
+            </w:pPr>
+            <w:r>
+              <w:rPr>
+                <w:rFonts w:ascii="Times New Roman" w:hAnsi="Times New Roman" w:eastAsia="標楷體"/>
+                <w:b/>
+                <w:color w:val="282828"/>
+                <w:sz w:val="24"/>
+              </w:rPr>
+              <w:t>長輩</w:t>
+            </w:r>
+          </w:p>
+          <w:p>
+            <w:pPr>
+              <w:spacing w:before="0" w:after="0" w:lineRule="exact" w:line="360"/>
+              <w:jc w:val="center"/>
+            </w:pPr>
+            <w:r>
+              <w:rPr>
+                <w:rFonts w:ascii="Times New Roman" w:hAnsi="Times New Roman" w:eastAsia="標楷體"/>
+                <w:b/>
+                <w:color w:val="282828"/>
+                <w:sz w:val="24"/>
+              </w:rPr>
+              <w:t>長輩</w:t>
+            </w:r>
+          </w:p>
+          <w:p>
+            <w:pPr>
+              <w:spacing w:before="0" w:after="0" w:lineRule="exact" w:line="360"/>
+              <w:jc w:val="center"/>
+            </w:pPr>
+            <w:r>
+              <w:rPr>
+                <w:rFonts w:ascii="Times New Roman" w:hAnsi="Times New Roman" w:eastAsia="標楷體"/>
+                <w:b/>
+                <w:color w:val="282828"/>
+                <w:sz w:val="24"/>
+              </w:rPr>
+              <w:t>長輩</w:t>
+            </w:r>
+          </w:p>
+          <w:p>
+            <w:pPr>
+              <w:spacing w:before="0" w:after="0" w:lineRule="exact" w:line="360"/>
+              <w:jc w:val="center"/>
+            </w:pPr>
+            <w:r>
+              <w:rPr>
+                <w:rFonts w:ascii="Times New Roman" w:hAnsi="Times New Roman" w:eastAsia="標楷體"/>
+                <w:b/>
+                <w:color w:val="282828"/>
+                <w:sz w:val="24"/>
+              </w:rPr>
+              <w:t>長輩</w:t>
+            </w:r>
+          </w:p>
+          <w:p>
+            <w:pPr>
+              <w:spacing w:before="0" w:after="0" w:lineRule="exact" w:line="360"/>
+              <w:jc w:val="center"/>
+            </w:pPr>
+            <w:r>
+              <w:rPr>
+                <w:rFonts w:ascii="Times New Roman" w:hAnsi="Times New Roman" w:eastAsia="標楷體"/>
+                <w:b/>
+                <w:color w:val="282828"/>
+                <w:sz w:val="24"/>
+              </w:rPr>
+              <w:t>長輩</w:t>
+            </w:r>
+          </w:p>
+          <w:p>
+            <w:pPr>
+              <w:spacing w:before="0" w:after="0" w:lineRule="exact" w:line="360"/>
+              <w:jc w:val="center"/>
+            </w:pPr>
+            <w:r>
+              <w:rPr>
+                <w:rFonts w:ascii="Times New Roman" w:hAnsi="Times New Roman" w:eastAsia="標楷體"/>
+                <w:b/>
+                <w:color w:val="282828"/>
+                <w:sz w:val="24"/>
+              </w:rPr>
+              <w:t>長輩</w:t>
+            </w:r>
+          </w:p>
+          <w:p>
+            <w:pPr>
+              <w:spacing w:before="0" w:after="0" w:lineRule="exact" w:line="360"/>
+              <w:jc w:val="center"/>
+            </w:pPr>
+            <w:r>
+              <w:rPr>
+                <w:rFonts w:ascii="Times New Roman" w:hAnsi="Times New Roman" w:eastAsia="標楷體"/>
+                <w:b/>
+                <w:color w:val="282828"/>
+                <w:sz w:val="24"/>
+              </w:rPr>
+              <w:t>長輩</w:t>
+            </w:r>
+          </w:p>
+          <w:p>
+            <w:pPr>
+              <w:spacing w:before="0" w:after="0" w:lineRule="exact" w:line="360"/>
+              <w:jc w:val="center"/>
+            </w:pPr>
+            <w:r>
+              <w:rPr>
+                <w:rFonts w:ascii="Times New Roman" w:hAnsi="Times New Roman" w:eastAsia="標楷體"/>
+                <w:b/>
+                <w:color w:val="282828"/>
+                <w:sz w:val="24"/>
+              </w:rPr>
+              <w:t>長輩</w:t>
+            </w:r>
+          </w:p>
+          <w:p>
+            <w:pPr>
+              <w:spacing w:before="0" w:after="0" w:lineRule="exact" w:line="360"/>
+              <w:jc w:val="center"/>
+            </w:pPr>
+            <w:r>
+              <w:rPr>
+                <w:rFonts w:ascii="Times New Roman" w:hAnsi="Times New Roman" w:eastAsia="標楷體"/>
+                <w:b/>
+                <w:color w:val="282828"/>
+                <w:sz w:val="24"/>
+              </w:rPr>
+              <w:t>長輩</w:t>
+            </w:r>
+          </w:p>
+          <w:p>
+            <w:pPr>
+              <w:spacing w:before="0" w:after="0" w:lineRule="exact" w:line="360"/>
+              <w:jc w:val="center"/>
+            </w:pPr>
+            <w:r>
+              <w:rPr>
+                <w:rFonts w:ascii="Times New Roman" w:hAnsi="Times New Roman" w:eastAsia="標楷體"/>
+                <w:b/>
+                <w:color w:val="282828"/>
+                <w:sz w:val="24"/>
+              </w:rPr>
+              <w:t>長輩</w:t>
+            </w:r>
+          </w:p>
+          <w:p>
+            <w:pPr>
+              <w:spacing w:before="0" w:after="0" w:lineRule="exact" w:line="360"/>
+              <w:jc w:val="center"/>
+            </w:pPr>
+            <w:r>
+              <w:rPr>
+                <w:rFonts w:ascii="Times New Roman" w:hAnsi="Times New Roman" w:eastAsia="標楷體"/>
+                <w:b/>
+                <w:color w:val="282828"/>
+                <w:sz w:val="24"/>
+              </w:rPr>
+              <w:t>長輩</w:t>
+            </w:r>
+          </w:p>
+          <w:p>
+            <w:pPr>
+              <w:spacing w:before="0" w:after="0" w:lineRule="exact" w:line="360"/>
+              <w:jc w:val="center"/>
+            </w:pPr>
+            <w:r>
+              <w:rPr>
+                <w:rFonts w:ascii="Times New Roman" w:hAnsi="Times New Roman" w:eastAsia="標楷體"/>
+                <w:b/>
+                <w:color w:val="282828"/>
+                <w:sz w:val="24"/>
+              </w:rPr>
+              <w:t>長輩</w:t>
+            </w:r>
+          </w:p>
+          <w:p>
+            <w:pPr>
+              <w:spacing w:before="0" w:after="0" w:lineRule="exact" w:line="360"/>
+              <w:jc w:val="center"/>
+            </w:pPr>
+            <w:r>
+              <w:rPr>
+                <w:rFonts w:ascii="Times New Roman" w:hAnsi="Times New Roman" w:eastAsia="標楷體"/>
+                <w:b/>
+                <w:color w:val="282828"/>
+                <w:sz w:val="24"/>
+              </w:rPr>
+              <w:t>長輩</w:t>
+            </w:r>
+          </w:p>
+          <w:p>
+            <w:pPr>
+              <w:spacing w:before="0" w:after="0" w:lineRule="exact" w:line="360"/>
+              <w:jc w:val="center"/>
+            </w:pPr>
+            <w:r>
+              <w:rPr>
+                <w:rFonts w:ascii="Times New Roman" w:hAnsi="Times New Roman" w:eastAsia="標楷體"/>
+                <w:b/>
+                <w:color w:val="282828"/>
+                <w:sz w:val="24"/>
+              </w:rPr>
+              <w:t>長輩</w:t>
+            </w:r>
+          </w:p>
+          <w:p>
+            <w:pPr>
+              <w:spacing w:before="0" w:after="0" w:lineRule="exact" w:line="360"/>
+              <w:jc w:val="center"/>
+            </w:pPr>
+            <w:r>
+              <w:rPr>
+                <w:rFonts w:ascii="Times New Roman" w:hAnsi="Times New Roman" w:eastAsia="標楷體"/>
+                <w:b/>
+                <w:color w:val="282828"/>
+                <w:sz w:val="24"/>
+              </w:rPr>
+              <w:t>長輩</w:t>
+            </w:r>
+          </w:p>
           <w:p>
             <w:pPr>
               <w:spacing w:before="0" w:after="0" w:lineRule="exact" w:line="360"/>
@@ -356,6 +710,7 @@
         <w:tc>
           <w:tcPr>
             <w:tcW w:type="dxa" w:w="1440"/>
+            <w:vMerge/>
             <w:shd w:fill="FAFAFA"/>
             <w:tcMar>
               <w:top w:w="50" w:type="dxa"/>
@@ -365,21 +720,7 @@
             </w:tcMar>
             <w:vAlign w:val="center"/>
           </w:tcPr>
-          <w:p>
-            <w:pPr>
-              <w:spacing w:before="0" w:after="0" w:lineRule="exact" w:line="360"/>
-              <w:jc w:val="center"/>
-            </w:pPr>
-            <w:r>
-              <w:rPr>
-                <w:rFonts w:ascii="Times New Roman" w:hAnsi="Times New Roman" w:eastAsia="標楷體"/>
-                <w:b/>
-                <w:color w:val="282828"/>
-                <w:sz w:val="24"/>
-              </w:rPr>
-              <w:t>長輩</w:t>
-            </w:r>
-          </w:p>
+          <w:p/>
         </w:tc>
         <w:tc>
           <w:tcPr>
@@ -473,6 +814,7 @@
         <w:tc>
           <w:tcPr>
             <w:tcW w:type="dxa" w:w="1440"/>
+            <w:vMerge/>
             <w:shd w:fill="FFFFFF"/>
             <w:tcMar>
               <w:top w:w="50" w:type="dxa"/>
@@ -482,21 +824,7 @@
             </w:tcMar>
             <w:vAlign w:val="center"/>
           </w:tcPr>
-          <w:p>
-            <w:pPr>
-              <w:spacing w:before="0" w:after="0" w:lineRule="exact" w:line="360"/>
-              <w:jc w:val="center"/>
-            </w:pPr>
-            <w:r>
-              <w:rPr>
-                <w:rFonts w:ascii="Times New Roman" w:hAnsi="Times New Roman" w:eastAsia="標楷體"/>
-                <w:b/>
-                <w:color w:val="282828"/>
-                <w:sz w:val="24"/>
-              </w:rPr>
-              <w:t>長輩</w:t>
-            </w:r>
-          </w:p>
+          <w:p/>
         </w:tc>
         <w:tc>
           <w:tcPr>
@@ -590,6 +918,7 @@
         <w:tc>
           <w:tcPr>
             <w:tcW w:type="dxa" w:w="1440"/>
+            <w:vMerge/>
             <w:shd w:fill="FAFAFA"/>
             <w:tcMar>
               <w:top w:w="50" w:type="dxa"/>
@@ -599,21 +928,7 @@
             </w:tcMar>
             <w:vAlign w:val="center"/>
           </w:tcPr>
-          <w:p>
-            <w:pPr>
-              <w:spacing w:before="0" w:after="0" w:lineRule="exact" w:line="360"/>
-              <w:jc w:val="center"/>
-            </w:pPr>
-            <w:r>
-              <w:rPr>
-                <w:rFonts w:ascii="Times New Roman" w:hAnsi="Times New Roman" w:eastAsia="標楷體"/>
-                <w:b/>
-                <w:color w:val="282828"/>
-                <w:sz w:val="24"/>
-              </w:rPr>
-              <w:t>長輩</w:t>
-            </w:r>
-          </w:p>
+          <w:p/>
         </w:tc>
         <w:tc>
           <w:tcPr>
@@ -707,6 +1022,7 @@
         <w:tc>
           <w:tcPr>
             <w:tcW w:type="dxa" w:w="1440"/>
+            <w:vMerge/>
             <w:shd w:fill="FFFFFF"/>
             <w:tcMar>
               <w:top w:w="50" w:type="dxa"/>
@@ -716,21 +1032,7 @@
             </w:tcMar>
             <w:vAlign w:val="center"/>
           </w:tcPr>
-          <w:p>
-            <w:pPr>
-              <w:spacing w:before="0" w:after="0" w:lineRule="exact" w:line="360"/>
-              <w:jc w:val="center"/>
-            </w:pPr>
-            <w:r>
-              <w:rPr>
-                <w:rFonts w:ascii="Times New Roman" w:hAnsi="Times New Roman" w:eastAsia="標楷體"/>
-                <w:b/>
-                <w:color w:val="282828"/>
-                <w:sz w:val="24"/>
-              </w:rPr>
-              <w:t>長輩</w:t>
-            </w:r>
-          </w:p>
+          <w:p/>
         </w:tc>
         <w:tc>
           <w:tcPr>
@@ -824,6 +1126,7 @@
         <w:tc>
           <w:tcPr>
             <w:tcW w:type="dxa" w:w="1440"/>
+            <w:vMerge/>
             <w:shd w:fill="FAFAFA"/>
             <w:tcMar>
               <w:top w:w="50" w:type="dxa"/>
@@ -833,21 +1136,7 @@
             </w:tcMar>
             <w:vAlign w:val="center"/>
           </w:tcPr>
-          <w:p>
-            <w:pPr>
-              <w:spacing w:before="0" w:after="0" w:lineRule="exact" w:line="360"/>
-              <w:jc w:val="center"/>
-            </w:pPr>
-            <w:r>
-              <w:rPr>
-                <w:rFonts w:ascii="Times New Roman" w:hAnsi="Times New Roman" w:eastAsia="標楷體"/>
-                <w:b/>
-                <w:color w:val="282828"/>
-                <w:sz w:val="24"/>
-              </w:rPr>
-              <w:t>長輩</w:t>
-            </w:r>
-          </w:p>
+          <w:p/>
         </w:tc>
         <w:tc>
           <w:tcPr>
@@ -941,6 +1230,7 @@
         <w:tc>
           <w:tcPr>
             <w:tcW w:type="dxa" w:w="1440"/>
+            <w:vMerge/>
             <w:shd w:fill="FFFFFF"/>
             <w:tcMar>
               <w:top w:w="50" w:type="dxa"/>
@@ -950,21 +1240,7 @@
             </w:tcMar>
             <w:vAlign w:val="center"/>
           </w:tcPr>
-          <w:p>
-            <w:pPr>
-              <w:spacing w:before="0" w:after="0" w:lineRule="exact" w:line="360"/>
-              <w:jc w:val="center"/>
-            </w:pPr>
-            <w:r>
-              <w:rPr>
-                <w:rFonts w:ascii="Times New Roman" w:hAnsi="Times New Roman" w:eastAsia="標楷體"/>
-                <w:b/>
-                <w:color w:val="282828"/>
-                <w:sz w:val="24"/>
-              </w:rPr>
-              <w:t>長輩</w:t>
-            </w:r>
-          </w:p>
+          <w:p/>
         </w:tc>
         <w:tc>
           <w:tcPr>
@@ -1058,6 +1334,7 @@
         <w:tc>
           <w:tcPr>
             <w:tcW w:type="dxa" w:w="1440"/>
+            <w:vMerge/>
             <w:shd w:fill="FAFAFA"/>
             <w:tcMar>
               <w:top w:w="50" w:type="dxa"/>
@@ -1067,21 +1344,7 @@
             </w:tcMar>
             <w:vAlign w:val="center"/>
           </w:tcPr>
-          <w:p>
-            <w:pPr>
-              <w:spacing w:before="0" w:after="0" w:lineRule="exact" w:line="360"/>
-              <w:jc w:val="center"/>
-            </w:pPr>
-            <w:r>
-              <w:rPr>
-                <w:rFonts w:ascii="Times New Roman" w:hAnsi="Times New Roman" w:eastAsia="標楷體"/>
-                <w:b/>
-                <w:color w:val="282828"/>
-                <w:sz w:val="24"/>
-              </w:rPr>
-              <w:t>長輩</w:t>
-            </w:r>
-          </w:p>
+          <w:p/>
         </w:tc>
         <w:tc>
           <w:tcPr>
@@ -1175,6 +1438,7 @@
         <w:tc>
           <w:tcPr>
             <w:tcW w:type="dxa" w:w="1440"/>
+            <w:vMerge/>
             <w:shd w:fill="FFFFFF"/>
             <w:tcMar>
               <w:top w:w="50" w:type="dxa"/>
@@ -1184,21 +1448,7 @@
             </w:tcMar>
             <w:vAlign w:val="center"/>
           </w:tcPr>
-          <w:p>
-            <w:pPr>
-              <w:spacing w:before="0" w:after="0" w:lineRule="exact" w:line="360"/>
-              <w:jc w:val="center"/>
-            </w:pPr>
-            <w:r>
-              <w:rPr>
-                <w:rFonts w:ascii="Times New Roman" w:hAnsi="Times New Roman" w:eastAsia="標楷體"/>
-                <w:b/>
-                <w:color w:val="282828"/>
-                <w:sz w:val="24"/>
-              </w:rPr>
-              <w:t>長輩</w:t>
-            </w:r>
-          </w:p>
+          <w:p/>
         </w:tc>
         <w:tc>
           <w:tcPr>
@@ -1292,6 +1542,7 @@
         <w:tc>
           <w:tcPr>
             <w:tcW w:type="dxa" w:w="1440"/>
+            <w:vMerge/>
             <w:shd w:fill="FAFAFA"/>
             <w:tcMar>
               <w:top w:w="50" w:type="dxa"/>
@@ -1301,21 +1552,7 @@
             </w:tcMar>
             <w:vAlign w:val="center"/>
           </w:tcPr>
-          <w:p>
-            <w:pPr>
-              <w:spacing w:before="0" w:after="0" w:lineRule="exact" w:line="360"/>
-              <w:jc w:val="center"/>
-            </w:pPr>
-            <w:r>
-              <w:rPr>
-                <w:rFonts w:ascii="Times New Roman" w:hAnsi="Times New Roman" w:eastAsia="標楷體"/>
-                <w:b/>
-                <w:color w:val="282828"/>
-                <w:sz w:val="24"/>
-              </w:rPr>
-              <w:t>長輩</w:t>
-            </w:r>
-          </w:p>
+          <w:p/>
         </w:tc>
         <w:tc>
           <w:tcPr>
@@ -1409,6 +1646,7 @@
         <w:tc>
           <w:tcPr>
             <w:tcW w:type="dxa" w:w="1440"/>
+            <w:vMerge/>
             <w:shd w:fill="FFFFFF"/>
             <w:tcMar>
               <w:top w:w="50" w:type="dxa"/>
@@ -1418,21 +1656,7 @@
             </w:tcMar>
             <w:vAlign w:val="center"/>
           </w:tcPr>
-          <w:p>
-            <w:pPr>
-              <w:spacing w:before="0" w:after="0" w:lineRule="exact" w:line="360"/>
-              <w:jc w:val="center"/>
-            </w:pPr>
-            <w:r>
-              <w:rPr>
-                <w:rFonts w:ascii="Times New Roman" w:hAnsi="Times New Roman" w:eastAsia="標楷體"/>
-                <w:b/>
-                <w:color w:val="282828"/>
-                <w:sz w:val="24"/>
-              </w:rPr>
-              <w:t>長輩</w:t>
-            </w:r>
-          </w:p>
+          <w:p/>
         </w:tc>
         <w:tc>
           <w:tcPr>
@@ -1526,6 +1750,7 @@
         <w:tc>
           <w:tcPr>
             <w:tcW w:type="dxa" w:w="1440"/>
+            <w:vMerge/>
             <w:shd w:fill="FAFAFA"/>
             <w:tcMar>
               <w:top w:w="50" w:type="dxa"/>
@@ -1535,21 +1760,7 @@
             </w:tcMar>
             <w:vAlign w:val="center"/>
           </w:tcPr>
-          <w:p>
-            <w:pPr>
-              <w:spacing w:before="0" w:after="0" w:lineRule="exact" w:line="360"/>
-              <w:jc w:val="center"/>
-            </w:pPr>
-            <w:r>
-              <w:rPr>
-                <w:rFonts w:ascii="Times New Roman" w:hAnsi="Times New Roman" w:eastAsia="標楷體"/>
-                <w:b/>
-                <w:color w:val="282828"/>
-                <w:sz w:val="24"/>
-              </w:rPr>
-              <w:t>長輩</w:t>
-            </w:r>
-          </w:p>
+          <w:p/>
         </w:tc>
         <w:tc>
           <w:tcPr>
@@ -1643,6 +1854,7 @@
         <w:tc>
           <w:tcPr>
             <w:tcW w:type="dxa" w:w="1440"/>
+            <w:vMerge/>
             <w:shd w:fill="FFFFFF"/>
             <w:tcMar>
               <w:top w:w="50" w:type="dxa"/>
@@ -1652,21 +1864,7 @@
             </w:tcMar>
             <w:vAlign w:val="center"/>
           </w:tcPr>
-          <w:p>
-            <w:pPr>
-              <w:spacing w:before="0" w:after="0" w:lineRule="exact" w:line="360"/>
-              <w:jc w:val="center"/>
-            </w:pPr>
-            <w:r>
-              <w:rPr>
-                <w:rFonts w:ascii="Times New Roman" w:hAnsi="Times New Roman" w:eastAsia="標楷體"/>
-                <w:b/>
-                <w:color w:val="282828"/>
-                <w:sz w:val="24"/>
-              </w:rPr>
-              <w:t>長輩</w:t>
-            </w:r>
-          </w:p>
+          <w:p/>
         </w:tc>
         <w:tc>
           <w:tcPr>
@@ -1760,6 +1958,7 @@
         <w:tc>
           <w:tcPr>
             <w:tcW w:type="dxa" w:w="1440"/>
+            <w:vMerge/>
             <w:shd w:fill="FAFAFA"/>
             <w:tcMar>
               <w:top w:w="50" w:type="dxa"/>
@@ -1769,21 +1968,7 @@
             </w:tcMar>
             <w:vAlign w:val="center"/>
           </w:tcPr>
-          <w:p>
-            <w:pPr>
-              <w:spacing w:before="0" w:after="0" w:lineRule="exact" w:line="360"/>
-              <w:jc w:val="center"/>
-            </w:pPr>
-            <w:r>
-              <w:rPr>
-                <w:rFonts w:ascii="Times New Roman" w:hAnsi="Times New Roman" w:eastAsia="標楷體"/>
-                <w:b/>
-                <w:color w:val="282828"/>
-                <w:sz w:val="24"/>
-              </w:rPr>
-              <w:t>長輩</w:t>
-            </w:r>
-          </w:p>
+          <w:p/>
         </w:tc>
         <w:tc>
           <w:tcPr>
@@ -1877,6 +2062,7 @@
         <w:tc>
           <w:tcPr>
             <w:tcW w:type="dxa" w:w="1440"/>
+            <w:vMerge/>
             <w:shd w:fill="FFFFFF"/>
             <w:tcMar>
               <w:top w:w="50" w:type="dxa"/>
@@ -1886,21 +2072,7 @@
             </w:tcMar>
             <w:vAlign w:val="center"/>
           </w:tcPr>
-          <w:p>
-            <w:pPr>
-              <w:spacing w:before="0" w:after="0" w:lineRule="exact" w:line="360"/>
-              <w:jc w:val="center"/>
-            </w:pPr>
-            <w:r>
-              <w:rPr>
-                <w:rFonts w:ascii="Times New Roman" w:hAnsi="Times New Roman" w:eastAsia="標楷體"/>
-                <w:b/>
-                <w:color w:val="282828"/>
-                <w:sz w:val="24"/>
-              </w:rPr>
-              <w:t>長輩</w:t>
-            </w:r>
-          </w:p>
+          <w:p/>
         </w:tc>
         <w:tc>
           <w:tcPr>
@@ -1994,6 +2166,7 @@
         <w:tc>
           <w:tcPr>
             <w:tcW w:type="dxa" w:w="1440"/>
+            <w:vMerge/>
             <w:shd w:fill="FAFAFA"/>
             <w:tcMar>
               <w:top w:w="50" w:type="dxa"/>
@@ -2003,21 +2176,7 @@
             </w:tcMar>
             <w:vAlign w:val="center"/>
           </w:tcPr>
-          <w:p>
-            <w:pPr>
-              <w:spacing w:before="0" w:after="0" w:lineRule="exact" w:line="360"/>
-              <w:jc w:val="center"/>
-            </w:pPr>
-            <w:r>
-              <w:rPr>
-                <w:rFonts w:ascii="Times New Roman" w:hAnsi="Times New Roman" w:eastAsia="標楷體"/>
-                <w:b/>
-                <w:color w:val="282828"/>
-                <w:sz w:val="24"/>
-              </w:rPr>
-              <w:t>長輩</w:t>
-            </w:r>
-          </w:p>
+          <w:p/>
         </w:tc>
         <w:tc>
           <w:tcPr>
@@ -2111,6 +2270,7 @@
         <w:tc>
           <w:tcPr>
             <w:tcW w:type="dxa" w:w="1440"/>
+            <w:vMerge/>
             <w:shd w:fill="FFFFFF"/>
             <w:tcMar>
               <w:top w:w="50" w:type="dxa"/>
@@ -2120,21 +2280,7 @@
             </w:tcMar>
             <w:vAlign w:val="center"/>
           </w:tcPr>
-          <w:p>
-            <w:pPr>
-              <w:spacing w:before="0" w:after="0" w:lineRule="exact" w:line="360"/>
-              <w:jc w:val="center"/>
-            </w:pPr>
-            <w:r>
-              <w:rPr>
-                <w:rFonts w:ascii="Times New Roman" w:hAnsi="Times New Roman" w:eastAsia="標楷體"/>
-                <w:b/>
-                <w:color w:val="282828"/>
-                <w:sz w:val="24"/>
-              </w:rPr>
-              <w:t>長輩</w:t>
-            </w:r>
-          </w:p>
+          <w:p/>
         </w:tc>
         <w:tc>
           <w:tcPr>
@@ -2228,6 +2374,7 @@
         <w:tc>
           <w:tcPr>
             <w:tcW w:type="dxa" w:w="1440"/>
+            <w:vMerge/>
             <w:shd w:fill="FAFAFA"/>
             <w:tcMar>
               <w:top w:w="50" w:type="dxa"/>
@@ -2237,21 +2384,7 @@
             </w:tcMar>
             <w:vAlign w:val="center"/>
           </w:tcPr>
-          <w:p>
-            <w:pPr>
-              <w:spacing w:before="0" w:after="0" w:lineRule="exact" w:line="360"/>
-              <w:jc w:val="center"/>
-            </w:pPr>
-            <w:r>
-              <w:rPr>
-                <w:rFonts w:ascii="Times New Roman" w:hAnsi="Times New Roman" w:eastAsia="標楷體"/>
-                <w:b/>
-                <w:color w:val="282828"/>
-                <w:sz w:val="24"/>
-              </w:rPr>
-              <w:t>長輩</w:t>
-            </w:r>
-          </w:p>
+          <w:p/>
         </w:tc>
         <w:tc>
           <w:tcPr>
@@ -2345,6 +2478,7 @@
         <w:tc>
           <w:tcPr>
             <w:tcW w:type="dxa" w:w="1440"/>
+            <w:vMerge/>
             <w:shd w:fill="FFFFFF"/>
             <w:tcMar>
               <w:top w:w="50" w:type="dxa"/>
@@ -2354,21 +2488,7 @@
             </w:tcMar>
             <w:vAlign w:val="center"/>
           </w:tcPr>
-          <w:p>
-            <w:pPr>
-              <w:spacing w:before="0" w:after="0" w:lineRule="exact" w:line="360"/>
-              <w:jc w:val="center"/>
-            </w:pPr>
-            <w:r>
-              <w:rPr>
-                <w:rFonts w:ascii="Times New Roman" w:hAnsi="Times New Roman" w:eastAsia="標楷體"/>
-                <w:b/>
-                <w:color w:val="282828"/>
-                <w:sz w:val="24"/>
-              </w:rPr>
-              <w:t>長輩</w:t>
-            </w:r>
-          </w:p>
+          <w:p/>
         </w:tc>
         <w:tc>
           <w:tcPr>
@@ -2462,6 +2582,7 @@
         <w:tc>
           <w:tcPr>
             <w:tcW w:type="dxa" w:w="1440"/>
+            <w:vMerge/>
             <w:shd w:fill="FAFAFA"/>
             <w:tcMar>
               <w:top w:w="50" w:type="dxa"/>
@@ -2471,21 +2592,7 @@
             </w:tcMar>
             <w:vAlign w:val="center"/>
           </w:tcPr>
-          <w:p>
-            <w:pPr>
-              <w:spacing w:before="0" w:after="0" w:lineRule="exact" w:line="360"/>
-              <w:jc w:val="center"/>
-            </w:pPr>
-            <w:r>
-              <w:rPr>
-                <w:rFonts w:ascii="Times New Roman" w:hAnsi="Times New Roman" w:eastAsia="標楷體"/>
-                <w:b/>
-                <w:color w:val="282828"/>
-                <w:sz w:val="24"/>
-              </w:rPr>
-              <w:t>長輩</w:t>
-            </w:r>
-          </w:p>
+          <w:p/>
         </w:tc>
         <w:tc>
           <w:tcPr>
@@ -2579,6 +2686,7 @@
         <w:tc>
           <w:tcPr>
             <w:tcW w:type="dxa" w:w="1440"/>
+            <w:vMerge/>
             <w:shd w:fill="FFFFFF"/>
             <w:tcMar>
               <w:top w:w="50" w:type="dxa"/>
@@ -2588,21 +2696,7 @@
             </w:tcMar>
             <w:vAlign w:val="center"/>
           </w:tcPr>
-          <w:p>
-            <w:pPr>
-              <w:spacing w:before="0" w:after="0" w:lineRule="exact" w:line="360"/>
-              <w:jc w:val="center"/>
-            </w:pPr>
-            <w:r>
-              <w:rPr>
-                <w:rFonts w:ascii="Times New Roman" w:hAnsi="Times New Roman" w:eastAsia="標楷體"/>
-                <w:b/>
-                <w:color w:val="282828"/>
-                <w:sz w:val="24"/>
-              </w:rPr>
-              <w:t>長輩</w:t>
-            </w:r>
-          </w:p>
+          <w:p/>
         </w:tc>
         <w:tc>
           <w:tcPr>
@@ -2696,6 +2790,7 @@
         <w:tc>
           <w:tcPr>
             <w:tcW w:type="dxa" w:w="1440"/>
+            <w:vMerge/>
             <w:shd w:fill="FAFAFA"/>
             <w:tcMar>
               <w:top w:w="50" w:type="dxa"/>
@@ -2705,21 +2800,7 @@
             </w:tcMar>
             <w:vAlign w:val="center"/>
           </w:tcPr>
-          <w:p>
-            <w:pPr>
-              <w:spacing w:before="0" w:after="0" w:lineRule="exact" w:line="360"/>
-              <w:jc w:val="center"/>
-            </w:pPr>
-            <w:r>
-              <w:rPr>
-                <w:rFonts w:ascii="Times New Roman" w:hAnsi="Times New Roman" w:eastAsia="標楷體"/>
-                <w:b/>
-                <w:color w:val="282828"/>
-                <w:sz w:val="24"/>
-              </w:rPr>
-              <w:t>長輩</w:t>
-            </w:r>
-          </w:p>
+          <w:p/>
         </w:tc>
         <w:tc>
           <w:tcPr>
@@ -2813,6 +2894,7 @@
         <w:tc>
           <w:tcPr>
             <w:tcW w:type="dxa" w:w="1440"/>
+            <w:vMerge/>
             <w:shd w:fill="FFFFFF"/>
             <w:tcMar>
               <w:top w:w="50" w:type="dxa"/>
@@ -2822,21 +2904,7 @@
             </w:tcMar>
             <w:vAlign w:val="center"/>
           </w:tcPr>
-          <w:p>
-            <w:pPr>
-              <w:spacing w:before="0" w:after="0" w:lineRule="exact" w:line="360"/>
-              <w:jc w:val="center"/>
-            </w:pPr>
-            <w:r>
-              <w:rPr>
-                <w:rFonts w:ascii="Times New Roman" w:hAnsi="Times New Roman" w:eastAsia="標楷體"/>
-                <w:b/>
-                <w:color w:val="282828"/>
-                <w:sz w:val="24"/>
-              </w:rPr>
-              <w:t>長輩</w:t>
-            </w:r>
-          </w:p>
+          <w:p/>
         </w:tc>
         <w:tc>
           <w:tcPr>
@@ -2930,6 +2998,7 @@
         <w:tc>
           <w:tcPr>
             <w:tcW w:type="dxa" w:w="1440"/>
+            <w:vMerge/>
             <w:shd w:fill="FAFAFA"/>
             <w:tcMar>
               <w:top w:w="50" w:type="dxa"/>
@@ -2939,21 +3008,7 @@
             </w:tcMar>
             <w:vAlign w:val="center"/>
           </w:tcPr>
-          <w:p>
-            <w:pPr>
-              <w:spacing w:before="0" w:after="0" w:lineRule="exact" w:line="360"/>
-              <w:jc w:val="center"/>
-            </w:pPr>
-            <w:r>
-              <w:rPr>
-                <w:rFonts w:ascii="Times New Roman" w:hAnsi="Times New Roman" w:eastAsia="標楷體"/>
-                <w:b/>
-                <w:color w:val="282828"/>
-                <w:sz w:val="24"/>
-              </w:rPr>
-              <w:t>長輩</w:t>
-            </w:r>
-          </w:p>
+          <w:p/>
         </w:tc>
         <w:tc>
           <w:tcPr>
@@ -3047,6 +3102,7 @@
         <w:tc>
           <w:tcPr>
             <w:tcW w:type="dxa" w:w="1440"/>
+            <w:vMerge w:val="restart"/>
             <w:shd w:fill="FFFFFF"/>
             <w:tcMar>
               <w:top w:w="50" w:type="dxa"/>
@@ -3055,7 +3111,300 @@
               <w:right w:w="90" w:type="dxa"/>
             </w:tcMar>
             <w:vAlign w:val="center"/>
-          </w:tcPr>
+            <w:shd w:fill="F2F5F9"/>
+            <w:tcMar>
+              <w:top w:w="60" w:type="dxa"/>
+              <w:bottom w:w="60" w:type="dxa"/>
+              <w:left w:w="90" w:type="dxa"/>
+              <w:right w:w="90" w:type="dxa"/>
+            </w:tcMar>
+          </w:tcPr>
+          <w:p>
+            <w:pPr>
+              <w:spacing w:before="0" w:after="0" w:lineRule="exact" w:line="360"/>
+              <w:jc w:val="center"/>
+            </w:pPr>
+            <w:r/>
+            <w:r>
+              <w:rPr>
+                <w:rFonts w:ascii="Times New Roman" w:hAnsi="Times New Roman" w:eastAsia="標楷體"/>
+                <w:b/>
+                <w:color w:val="142850"/>
+                <w:sz w:val="24"/>
+              </w:rPr>
+              <w:t>家屬</w:t>
+            </w:r>
+          </w:p>
+          <w:p>
+            <w:pPr>
+              <w:spacing w:before="0" w:after="0" w:lineRule="exact" w:line="360"/>
+              <w:jc w:val="center"/>
+            </w:pPr>
+            <w:r>
+              <w:rPr>
+                <w:rFonts w:ascii="Times New Roman" w:hAnsi="Times New Roman" w:eastAsia="標楷體"/>
+                <w:b/>
+                <w:color w:val="282828"/>
+                <w:sz w:val="24"/>
+              </w:rPr>
+              <w:t>家屬</w:t>
+            </w:r>
+          </w:p>
+          <w:p>
+            <w:pPr>
+              <w:spacing w:before="0" w:after="0" w:lineRule="exact" w:line="360"/>
+              <w:jc w:val="center"/>
+            </w:pPr>
+            <w:r>
+              <w:rPr>
+                <w:rFonts w:ascii="Times New Roman" w:hAnsi="Times New Roman" w:eastAsia="標楷體"/>
+                <w:b/>
+                <w:color w:val="282828"/>
+                <w:sz w:val="24"/>
+              </w:rPr>
+              <w:t>家屬</w:t>
+            </w:r>
+          </w:p>
+          <w:p>
+            <w:pPr>
+              <w:spacing w:before="0" w:after="0" w:lineRule="exact" w:line="360"/>
+              <w:jc w:val="center"/>
+            </w:pPr>
+            <w:r>
+              <w:rPr>
+                <w:rFonts w:ascii="Times New Roman" w:hAnsi="Times New Roman" w:eastAsia="標楷體"/>
+                <w:b/>
+                <w:color w:val="282828"/>
+                <w:sz w:val="24"/>
+              </w:rPr>
+              <w:t>家屬</w:t>
+            </w:r>
+          </w:p>
+          <w:p>
+            <w:pPr>
+              <w:spacing w:before="0" w:after="0" w:lineRule="exact" w:line="360"/>
+              <w:jc w:val="center"/>
+            </w:pPr>
+            <w:r>
+              <w:rPr>
+                <w:rFonts w:ascii="Times New Roman" w:hAnsi="Times New Roman" w:eastAsia="標楷體"/>
+                <w:b/>
+                <w:color w:val="282828"/>
+                <w:sz w:val="24"/>
+              </w:rPr>
+              <w:t>家屬</w:t>
+            </w:r>
+          </w:p>
+          <w:p>
+            <w:pPr>
+              <w:spacing w:before="0" w:after="0" w:lineRule="exact" w:line="360"/>
+              <w:jc w:val="center"/>
+            </w:pPr>
+            <w:r>
+              <w:rPr>
+                <w:rFonts w:ascii="Times New Roman" w:hAnsi="Times New Roman" w:eastAsia="標楷體"/>
+                <w:b/>
+                <w:color w:val="282828"/>
+                <w:sz w:val="24"/>
+              </w:rPr>
+              <w:t>家屬</w:t>
+            </w:r>
+          </w:p>
+          <w:p>
+            <w:pPr>
+              <w:spacing w:before="0" w:after="0" w:lineRule="exact" w:line="360"/>
+              <w:jc w:val="center"/>
+            </w:pPr>
+            <w:r>
+              <w:rPr>
+                <w:rFonts w:ascii="Times New Roman" w:hAnsi="Times New Roman" w:eastAsia="標楷體"/>
+                <w:b/>
+                <w:color w:val="282828"/>
+                <w:sz w:val="24"/>
+              </w:rPr>
+              <w:t>家屬</w:t>
+            </w:r>
+          </w:p>
+          <w:p>
+            <w:pPr>
+              <w:spacing w:before="0" w:after="0" w:lineRule="exact" w:line="360"/>
+              <w:jc w:val="center"/>
+            </w:pPr>
+            <w:r>
+              <w:rPr>
+                <w:rFonts w:ascii="Times New Roman" w:hAnsi="Times New Roman" w:eastAsia="標楷體"/>
+                <w:b/>
+                <w:color w:val="282828"/>
+                <w:sz w:val="24"/>
+              </w:rPr>
+              <w:t>家屬</w:t>
+            </w:r>
+          </w:p>
+          <w:p>
+            <w:pPr>
+              <w:spacing w:before="0" w:after="0" w:lineRule="exact" w:line="360"/>
+              <w:jc w:val="center"/>
+            </w:pPr>
+            <w:r>
+              <w:rPr>
+                <w:rFonts w:ascii="Times New Roman" w:hAnsi="Times New Roman" w:eastAsia="標楷體"/>
+                <w:b/>
+                <w:color w:val="282828"/>
+                <w:sz w:val="24"/>
+              </w:rPr>
+              <w:t>家屬</w:t>
+            </w:r>
+          </w:p>
+          <w:p>
+            <w:pPr>
+              <w:spacing w:before="0" w:after="0" w:lineRule="exact" w:line="360"/>
+              <w:jc w:val="center"/>
+            </w:pPr>
+            <w:r>
+              <w:rPr>
+                <w:rFonts w:ascii="Times New Roman" w:hAnsi="Times New Roman" w:eastAsia="標楷體"/>
+                <w:b/>
+                <w:color w:val="282828"/>
+                <w:sz w:val="24"/>
+              </w:rPr>
+              <w:t>家屬</w:t>
+            </w:r>
+          </w:p>
+          <w:p>
+            <w:pPr>
+              <w:spacing w:before="0" w:after="0" w:lineRule="exact" w:line="360"/>
+              <w:jc w:val="center"/>
+            </w:pPr>
+            <w:r>
+              <w:rPr>
+                <w:rFonts w:ascii="Times New Roman" w:hAnsi="Times New Roman" w:eastAsia="標楷體"/>
+                <w:b/>
+                <w:color w:val="282828"/>
+                <w:sz w:val="24"/>
+              </w:rPr>
+              <w:t>家屬</w:t>
+            </w:r>
+          </w:p>
+          <w:p>
+            <w:pPr>
+              <w:spacing w:before="0" w:after="0" w:lineRule="exact" w:line="360"/>
+              <w:jc w:val="center"/>
+            </w:pPr>
+            <w:r>
+              <w:rPr>
+                <w:rFonts w:ascii="Times New Roman" w:hAnsi="Times New Roman" w:eastAsia="標楷體"/>
+                <w:b/>
+                <w:color w:val="282828"/>
+                <w:sz w:val="24"/>
+              </w:rPr>
+              <w:t>家屬</w:t>
+            </w:r>
+          </w:p>
+          <w:p>
+            <w:pPr>
+              <w:spacing w:before="0" w:after="0" w:lineRule="exact" w:line="360"/>
+              <w:jc w:val="center"/>
+            </w:pPr>
+            <w:r>
+              <w:rPr>
+                <w:rFonts w:ascii="Times New Roman" w:hAnsi="Times New Roman" w:eastAsia="標楷體"/>
+                <w:b/>
+                <w:color w:val="282828"/>
+                <w:sz w:val="24"/>
+              </w:rPr>
+              <w:t>家屬</w:t>
+            </w:r>
+          </w:p>
+          <w:p>
+            <w:pPr>
+              <w:spacing w:before="0" w:after="0" w:lineRule="exact" w:line="360"/>
+              <w:jc w:val="center"/>
+            </w:pPr>
+            <w:r>
+              <w:rPr>
+                <w:rFonts w:ascii="Times New Roman" w:hAnsi="Times New Roman" w:eastAsia="標楷體"/>
+                <w:b/>
+                <w:color w:val="282828"/>
+                <w:sz w:val="24"/>
+              </w:rPr>
+              <w:t>家屬</w:t>
+            </w:r>
+          </w:p>
+          <w:p>
+            <w:pPr>
+              <w:spacing w:before="0" w:after="0" w:lineRule="exact" w:line="360"/>
+              <w:jc w:val="center"/>
+            </w:pPr>
+            <w:r>
+              <w:rPr>
+                <w:rFonts w:ascii="Times New Roman" w:hAnsi="Times New Roman" w:eastAsia="標楷體"/>
+                <w:b/>
+                <w:color w:val="282828"/>
+                <w:sz w:val="24"/>
+              </w:rPr>
+              <w:t>家屬</w:t>
+            </w:r>
+          </w:p>
+          <w:p>
+            <w:pPr>
+              <w:spacing w:before="0" w:after="0" w:lineRule="exact" w:line="360"/>
+              <w:jc w:val="center"/>
+            </w:pPr>
+            <w:r>
+              <w:rPr>
+                <w:rFonts w:ascii="Times New Roman" w:hAnsi="Times New Roman" w:eastAsia="標楷體"/>
+                <w:b/>
+                <w:color w:val="282828"/>
+                <w:sz w:val="24"/>
+              </w:rPr>
+              <w:t>家屬</w:t>
+            </w:r>
+          </w:p>
+          <w:p>
+            <w:pPr>
+              <w:spacing w:before="0" w:after="0" w:lineRule="exact" w:line="360"/>
+              <w:jc w:val="center"/>
+            </w:pPr>
+            <w:r>
+              <w:rPr>
+                <w:rFonts w:ascii="Times New Roman" w:hAnsi="Times New Roman" w:eastAsia="標楷體"/>
+                <w:b/>
+                <w:color w:val="282828"/>
+                <w:sz w:val="24"/>
+              </w:rPr>
+              <w:t>家屬</w:t>
+            </w:r>
+          </w:p>
+          <w:p>
+            <w:pPr>
+              <w:spacing w:before="0" w:after="0" w:lineRule="exact" w:line="360"/>
+              <w:jc w:val="center"/>
+            </w:pPr>
+            <w:r>
+              <w:rPr>
+                <w:rFonts w:ascii="Times New Roman" w:hAnsi="Times New Roman" w:eastAsia="標楷體"/>
+                <w:b/>
+                <w:color w:val="282828"/>
+                <w:sz w:val="24"/>
+              </w:rPr>
+              <w:t>家屬</w:t>
+            </w:r>
+          </w:p>
+          <w:p>
+            <w:pPr>
+              <w:spacing w:before="0" w:after="0" w:lineRule="exact" w:line="360"/>
+              <w:jc w:val="center"/>
+            </w:pPr>
+            <w:r>
+              <w:rPr>
+                <w:rFonts w:ascii="Times New Roman" w:hAnsi="Times New Roman" w:eastAsia="標楷體"/>
+                <w:b/>
+                <w:color w:val="282828"/>
+                <w:sz w:val="24"/>
+              </w:rPr>
+              <w:t>家屬</w:t>
+            </w:r>
+          </w:p>
           <w:p>
             <w:pPr>
               <w:spacing w:before="0" w:after="0" w:lineRule="exact" w:line="360"/>
@@ -3164,6 +3513,7 @@
         <w:tc>
           <w:tcPr>
             <w:tcW w:type="dxa" w:w="1440"/>
+            <w:vMerge/>
             <w:shd w:fill="FAFAFA"/>
             <w:tcMar>
               <w:top w:w="50" w:type="dxa"/>
@@ -3173,21 +3523,7 @@
             </w:tcMar>
             <w:vAlign w:val="center"/>
           </w:tcPr>
-          <w:p>
-            <w:pPr>
-              <w:spacing w:before="0" w:after="0" w:lineRule="exact" w:line="360"/>
-              <w:jc w:val="center"/>
-            </w:pPr>
-            <w:r>
-              <w:rPr>
-                <w:rFonts w:ascii="Times New Roman" w:hAnsi="Times New Roman" w:eastAsia="標楷體"/>
-                <w:b/>
-                <w:color w:val="282828"/>
-                <w:sz w:val="24"/>
-              </w:rPr>
-              <w:t>家屬</w:t>
-            </w:r>
-          </w:p>
+          <w:p/>
         </w:tc>
         <w:tc>
           <w:tcPr>
@@ -3281,6 +3617,7 @@
         <w:tc>
           <w:tcPr>
             <w:tcW w:type="dxa" w:w="1440"/>
+            <w:vMerge/>
             <w:shd w:fill="FFFFFF"/>
             <w:tcMar>
               <w:top w:w="50" w:type="dxa"/>
@@ -3290,21 +3627,7 @@
             </w:tcMar>
             <w:vAlign w:val="center"/>
           </w:tcPr>
-          <w:p>
-            <w:pPr>
-              <w:spacing w:before="0" w:after="0" w:lineRule="exact" w:line="360"/>
-              <w:jc w:val="center"/>
-            </w:pPr>
-            <w:r>
-              <w:rPr>
-                <w:rFonts w:ascii="Times New Roman" w:hAnsi="Times New Roman" w:eastAsia="標楷體"/>
-                <w:b/>
-                <w:color w:val="282828"/>
-                <w:sz w:val="24"/>
-              </w:rPr>
-              <w:t>家屬</w:t>
-            </w:r>
-          </w:p>
+          <w:p/>
         </w:tc>
         <w:tc>
           <w:tcPr>
@@ -3398,6 +3721,7 @@
         <w:tc>
           <w:tcPr>
             <w:tcW w:type="dxa" w:w="1440"/>
+            <w:vMerge/>
             <w:shd w:fill="FAFAFA"/>
             <w:tcMar>
               <w:top w:w="50" w:type="dxa"/>
@@ -3407,21 +3731,7 @@
             </w:tcMar>
             <w:vAlign w:val="center"/>
           </w:tcPr>
-          <w:p>
-            <w:pPr>
-              <w:spacing w:before="0" w:after="0" w:lineRule="exact" w:line="360"/>
-              <w:jc w:val="center"/>
-            </w:pPr>
-            <w:r>
-              <w:rPr>
-                <w:rFonts w:ascii="Times New Roman" w:hAnsi="Times New Roman" w:eastAsia="標楷體"/>
-                <w:b/>
-                <w:color w:val="282828"/>
-                <w:sz w:val="24"/>
-              </w:rPr>
-              <w:t>家屬</w:t>
-            </w:r>
-          </w:p>
+          <w:p/>
         </w:tc>
         <w:tc>
           <w:tcPr>
@@ -3515,6 +3825,7 @@
         <w:tc>
           <w:tcPr>
             <w:tcW w:type="dxa" w:w="1440"/>
+            <w:vMerge/>
             <w:shd w:fill="FFFFFF"/>
             <w:tcMar>
               <w:top w:w="50" w:type="dxa"/>
@@ -3524,21 +3835,7 @@
             </w:tcMar>
             <w:vAlign w:val="center"/>
           </w:tcPr>
-          <w:p>
-            <w:pPr>
-              <w:spacing w:before="0" w:after="0" w:lineRule="exact" w:line="360"/>
-              <w:jc w:val="center"/>
-            </w:pPr>
-            <w:r>
-              <w:rPr>
-                <w:rFonts w:ascii="Times New Roman" w:hAnsi="Times New Roman" w:eastAsia="標楷體"/>
-                <w:b/>
-                <w:color w:val="282828"/>
-                <w:sz w:val="24"/>
-              </w:rPr>
-              <w:t>家屬</w:t>
-            </w:r>
-          </w:p>
+          <w:p/>
         </w:tc>
         <w:tc>
           <w:tcPr>
@@ -3632,6 +3929,7 @@
         <w:tc>
           <w:tcPr>
             <w:tcW w:type="dxa" w:w="1440"/>
+            <w:vMerge/>
             <w:shd w:fill="FAFAFA"/>
             <w:tcMar>
               <w:top w:w="50" w:type="dxa"/>
@@ -3641,21 +3939,7 @@
             </w:tcMar>
             <w:vAlign w:val="center"/>
           </w:tcPr>
-          <w:p>
-            <w:pPr>
-              <w:spacing w:before="0" w:after="0" w:lineRule="exact" w:line="360"/>
-              <w:jc w:val="center"/>
-            </w:pPr>
-            <w:r>
-              <w:rPr>
-                <w:rFonts w:ascii="Times New Roman" w:hAnsi="Times New Roman" w:eastAsia="標楷體"/>
-                <w:b/>
-                <w:color w:val="282828"/>
-                <w:sz w:val="24"/>
-              </w:rPr>
-              <w:t>家屬</w:t>
-            </w:r>
-          </w:p>
+          <w:p/>
         </w:tc>
         <w:tc>
           <w:tcPr>
@@ -3749,6 +4033,7 @@
         <w:tc>
           <w:tcPr>
             <w:tcW w:type="dxa" w:w="1440"/>
+            <w:vMerge/>
             <w:shd w:fill="FFFFFF"/>
             <w:tcMar>
               <w:top w:w="50" w:type="dxa"/>
@@ -3758,21 +4043,7 @@
             </w:tcMar>
             <w:vAlign w:val="center"/>
           </w:tcPr>
-          <w:p>
-            <w:pPr>
-              <w:spacing w:before="0" w:after="0" w:lineRule="exact" w:line="360"/>
-              <w:jc w:val="center"/>
-            </w:pPr>
-            <w:r>
-              <w:rPr>
-                <w:rFonts w:ascii="Times New Roman" w:hAnsi="Times New Roman" w:eastAsia="標楷體"/>
-                <w:b/>
-                <w:color w:val="282828"/>
-                <w:sz w:val="24"/>
-              </w:rPr>
-              <w:t>家屬</w:t>
-            </w:r>
-          </w:p>
+          <w:p/>
         </w:tc>
         <w:tc>
           <w:tcPr>
@@ -3866,6 +4137,7 @@
         <w:tc>
           <w:tcPr>
             <w:tcW w:type="dxa" w:w="1440"/>
+            <w:vMerge/>
             <w:shd w:fill="FAFAFA"/>
             <w:tcMar>
               <w:top w:w="50" w:type="dxa"/>
@@ -3875,21 +4147,7 @@
             </w:tcMar>
             <w:vAlign w:val="center"/>
           </w:tcPr>
-          <w:p>
-            <w:pPr>
-              <w:spacing w:before="0" w:after="0" w:lineRule="exact" w:line="360"/>
-              <w:jc w:val="center"/>
-            </w:pPr>
-            <w:r>
-              <w:rPr>
-                <w:rFonts w:ascii="Times New Roman" w:hAnsi="Times New Roman" w:eastAsia="標楷體"/>
-                <w:b/>
-                <w:color w:val="282828"/>
-                <w:sz w:val="24"/>
-              </w:rPr>
-              <w:t>家屬</w:t>
-            </w:r>
-          </w:p>
+          <w:p/>
         </w:tc>
         <w:tc>
           <w:tcPr>
@@ -3983,6 +4241,7 @@
         <w:tc>
           <w:tcPr>
             <w:tcW w:type="dxa" w:w="1440"/>
+            <w:vMerge/>
             <w:shd w:fill="FFFFFF"/>
             <w:tcMar>
               <w:top w:w="50" w:type="dxa"/>
@@ -3992,21 +4251,7 @@
             </w:tcMar>
             <w:vAlign w:val="center"/>
           </w:tcPr>
-          <w:p>
-            <w:pPr>
-              <w:spacing w:before="0" w:after="0" w:lineRule="exact" w:line="360"/>
-              <w:jc w:val="center"/>
-            </w:pPr>
-            <w:r>
-              <w:rPr>
-                <w:rFonts w:ascii="Times New Roman" w:hAnsi="Times New Roman" w:eastAsia="標楷體"/>
-                <w:b/>
-                <w:color w:val="282828"/>
-                <w:sz w:val="24"/>
-              </w:rPr>
-              <w:t>家屬</w:t>
-            </w:r>
-          </w:p>
+          <w:p/>
         </w:tc>
         <w:tc>
           <w:tcPr>
@@ -4100,6 +4345,7 @@
         <w:tc>
           <w:tcPr>
             <w:tcW w:type="dxa" w:w="1440"/>
+            <w:vMerge/>
             <w:shd w:fill="FAFAFA"/>
             <w:tcMar>
               <w:top w:w="50" w:type="dxa"/>
@@ -4109,21 +4355,7 @@
             </w:tcMar>
             <w:vAlign w:val="center"/>
           </w:tcPr>
-          <w:p>
-            <w:pPr>
-              <w:spacing w:before="0" w:after="0" w:lineRule="exact" w:line="360"/>
-              <w:jc w:val="center"/>
-            </w:pPr>
-            <w:r>
-              <w:rPr>
-                <w:rFonts w:ascii="Times New Roman" w:hAnsi="Times New Roman" w:eastAsia="標楷體"/>
-                <w:b/>
-                <w:color w:val="282828"/>
-                <w:sz w:val="24"/>
-              </w:rPr>
-              <w:t>家屬</w:t>
-            </w:r>
-          </w:p>
+          <w:p/>
         </w:tc>
         <w:tc>
           <w:tcPr>
@@ -4217,6 +4449,7 @@
         <w:tc>
           <w:tcPr>
             <w:tcW w:type="dxa" w:w="1440"/>
+            <w:vMerge/>
             <w:shd w:fill="FFFFFF"/>
             <w:tcMar>
               <w:top w:w="50" w:type="dxa"/>
@@ -4226,21 +4459,7 @@
             </w:tcMar>
             <w:vAlign w:val="center"/>
           </w:tcPr>
-          <w:p>
-            <w:pPr>
-              <w:spacing w:before="0" w:after="0" w:lineRule="exact" w:line="360"/>
-              <w:jc w:val="center"/>
-            </w:pPr>
-            <w:r>
-              <w:rPr>
-                <w:rFonts w:ascii="Times New Roman" w:hAnsi="Times New Roman" w:eastAsia="標楷體"/>
-                <w:b/>
-                <w:color w:val="282828"/>
-                <w:sz w:val="24"/>
-              </w:rPr>
-              <w:t>家屬</w:t>
-            </w:r>
-          </w:p>
+          <w:p/>
         </w:tc>
         <w:tc>
           <w:tcPr>
@@ -4334,6 +4553,7 @@
         <w:tc>
           <w:tcPr>
             <w:tcW w:type="dxa" w:w="1440"/>
+            <w:vMerge/>
             <w:shd w:fill="FAFAFA"/>
             <w:tcMar>
               <w:top w:w="50" w:type="dxa"/>
@@ -4343,21 +4563,7 @@
             </w:tcMar>
             <w:vAlign w:val="center"/>
           </w:tcPr>
-          <w:p>
-            <w:pPr>
-              <w:spacing w:before="0" w:after="0" w:lineRule="exact" w:line="360"/>
-              <w:jc w:val="center"/>
-            </w:pPr>
-            <w:r>
-              <w:rPr>
-                <w:rFonts w:ascii="Times New Roman" w:hAnsi="Times New Roman" w:eastAsia="標楷體"/>
-                <w:b/>
-                <w:color w:val="282828"/>
-                <w:sz w:val="24"/>
-              </w:rPr>
-              <w:t>家屬</w:t>
-            </w:r>
-          </w:p>
+          <w:p/>
         </w:tc>
         <w:tc>
           <w:tcPr>
@@ -4451,6 +4657,7 @@
         <w:tc>
           <w:tcPr>
             <w:tcW w:type="dxa" w:w="1440"/>
+            <w:vMerge/>
             <w:shd w:fill="FFFFFF"/>
             <w:tcMar>
               <w:top w:w="50" w:type="dxa"/>
@@ -4460,21 +4667,7 @@
             </w:tcMar>
             <w:vAlign w:val="center"/>
           </w:tcPr>
-          <w:p>
-            <w:pPr>
-              <w:spacing w:before="0" w:after="0" w:lineRule="exact" w:line="360"/>
-              <w:jc w:val="center"/>
-            </w:pPr>
-            <w:r>
-              <w:rPr>
-                <w:rFonts w:ascii="Times New Roman" w:hAnsi="Times New Roman" w:eastAsia="標楷體"/>
-                <w:b/>
-                <w:color w:val="282828"/>
-                <w:sz w:val="24"/>
-              </w:rPr>
-              <w:t>家屬</w:t>
-            </w:r>
-          </w:p>
+          <w:p/>
         </w:tc>
         <w:tc>
           <w:tcPr>
@@ -4568,6 +4761,7 @@
         <w:tc>
           <w:tcPr>
             <w:tcW w:type="dxa" w:w="1440"/>
+            <w:vMerge/>
             <w:shd w:fill="FAFAFA"/>
             <w:tcMar>
               <w:top w:w="50" w:type="dxa"/>
@@ -4577,21 +4771,7 @@
             </w:tcMar>
             <w:vAlign w:val="center"/>
           </w:tcPr>
-          <w:p>
-            <w:pPr>
-              <w:spacing w:before="0" w:after="0" w:lineRule="exact" w:line="360"/>
-              <w:jc w:val="center"/>
-            </w:pPr>
-            <w:r>
-              <w:rPr>
-                <w:rFonts w:ascii="Times New Roman" w:hAnsi="Times New Roman" w:eastAsia="標楷體"/>
-                <w:b/>
-                <w:color w:val="282828"/>
-                <w:sz w:val="24"/>
-              </w:rPr>
-              <w:t>家屬</w:t>
-            </w:r>
-          </w:p>
+          <w:p/>
         </w:tc>
         <w:tc>
           <w:tcPr>
@@ -4685,6 +4865,7 @@
         <w:tc>
           <w:tcPr>
             <w:tcW w:type="dxa" w:w="1440"/>
+            <w:vMerge/>
             <w:shd w:fill="FFFFFF"/>
             <w:tcMar>
               <w:top w:w="50" w:type="dxa"/>
@@ -4694,21 +4875,7 @@
             </w:tcMar>
             <w:vAlign w:val="center"/>
           </w:tcPr>
-          <w:p>
-            <w:pPr>
-              <w:spacing w:before="0" w:after="0" w:lineRule="exact" w:line="360"/>
-              <w:jc w:val="center"/>
-            </w:pPr>
-            <w:r>
-              <w:rPr>
-                <w:rFonts w:ascii="Times New Roman" w:hAnsi="Times New Roman" w:eastAsia="標楷體"/>
-                <w:b/>
-                <w:color w:val="282828"/>
-                <w:sz w:val="24"/>
-              </w:rPr>
-              <w:t>家屬</w:t>
-            </w:r>
-          </w:p>
+          <w:p/>
         </w:tc>
         <w:tc>
           <w:tcPr>
@@ -4802,6 +4969,7 @@
         <w:tc>
           <w:tcPr>
             <w:tcW w:type="dxa" w:w="1440"/>
+            <w:vMerge/>
             <w:shd w:fill="FAFAFA"/>
             <w:tcMar>
               <w:top w:w="50" w:type="dxa"/>
@@ -4811,21 +4979,7 @@
             </w:tcMar>
             <w:vAlign w:val="center"/>
           </w:tcPr>
-          <w:p>
-            <w:pPr>
-              <w:spacing w:before="0" w:after="0" w:lineRule="exact" w:line="360"/>
-              <w:jc w:val="center"/>
-            </w:pPr>
-            <w:r>
-              <w:rPr>
-                <w:rFonts w:ascii="Times New Roman" w:hAnsi="Times New Roman" w:eastAsia="標楷體"/>
-                <w:b/>
-                <w:color w:val="282828"/>
-                <w:sz w:val="24"/>
-              </w:rPr>
-              <w:t>家屬</w:t>
-            </w:r>
-          </w:p>
+          <w:p/>
         </w:tc>
         <w:tc>
           <w:tcPr>
@@ -4919,6 +5073,7 @@
         <w:tc>
           <w:tcPr>
             <w:tcW w:type="dxa" w:w="1440"/>
+            <w:vMerge/>
             <w:shd w:fill="FFFFFF"/>
             <w:tcMar>
               <w:top w:w="50" w:type="dxa"/>
@@ -4928,21 +5083,7 @@
             </w:tcMar>
             <w:vAlign w:val="center"/>
           </w:tcPr>
-          <w:p>
-            <w:pPr>
-              <w:spacing w:before="0" w:after="0" w:lineRule="exact" w:line="360"/>
-              <w:jc w:val="center"/>
-            </w:pPr>
-            <w:r>
-              <w:rPr>
-                <w:rFonts w:ascii="Times New Roman" w:hAnsi="Times New Roman" w:eastAsia="標楷體"/>
-                <w:b/>
-                <w:color w:val="282828"/>
-                <w:sz w:val="24"/>
-              </w:rPr>
-              <w:t>家屬</w:t>
-            </w:r>
-          </w:p>
+          <w:p/>
         </w:tc>
         <w:tc>
           <w:tcPr>
@@ -5036,6 +5177,7 @@
         <w:tc>
           <w:tcPr>
             <w:tcW w:type="dxa" w:w="1440"/>
+            <w:vMerge/>
             <w:shd w:fill="FAFAFA"/>
             <w:tcMar>
               <w:top w:w="50" w:type="dxa"/>
@@ -5045,21 +5187,7 @@
             </w:tcMar>
             <w:vAlign w:val="center"/>
           </w:tcPr>
-          <w:p>
-            <w:pPr>
-              <w:spacing w:before="0" w:after="0" w:lineRule="exact" w:line="360"/>
-              <w:jc w:val="center"/>
-            </w:pPr>
-            <w:r>
-              <w:rPr>
-                <w:rFonts w:ascii="Times New Roman" w:hAnsi="Times New Roman" w:eastAsia="標楷體"/>
-                <w:b/>
-                <w:color w:val="282828"/>
-                <w:sz w:val="24"/>
-              </w:rPr>
-              <w:t>家屬</w:t>
-            </w:r>
-          </w:p>
+          <w:p/>
         </w:tc>
         <w:tc>
           <w:tcPr>
@@ -5153,6 +5281,7 @@
         <w:tc>
           <w:tcPr>
             <w:tcW w:type="dxa" w:w="1440"/>
+            <w:vMerge/>
             <w:shd w:fill="FFFFFF"/>
             <w:tcMar>
               <w:top w:w="50" w:type="dxa"/>
@@ -5162,21 +5291,7 @@
             </w:tcMar>
             <w:vAlign w:val="center"/>
           </w:tcPr>
-          <w:p>
-            <w:pPr>
-              <w:spacing w:before="0" w:after="0" w:lineRule="exact" w:line="360"/>
-              <w:jc w:val="center"/>
-            </w:pPr>
-            <w:r>
-              <w:rPr>
-                <w:rFonts w:ascii="Times New Roman" w:hAnsi="Times New Roman" w:eastAsia="標楷體"/>
-                <w:b/>
-                <w:color w:val="282828"/>
-                <w:sz w:val="24"/>
-              </w:rPr>
-              <w:t>家屬</w:t>
-            </w:r>
-          </w:p>
+          <w:p/>
         </w:tc>
         <w:tc>
           <w:tcPr>
@@ -5270,6 +5385,7 @@
         <w:tc>
           <w:tcPr>
             <w:tcW w:type="dxa" w:w="1440"/>
+            <w:vMerge/>
             <w:shd w:fill="FAFAFA"/>
             <w:tcMar>
               <w:top w:w="50" w:type="dxa"/>
@@ -5279,21 +5395,7 @@
             </w:tcMar>
             <w:vAlign w:val="center"/>
           </w:tcPr>
-          <w:p>
-            <w:pPr>
-              <w:spacing w:before="0" w:after="0" w:lineRule="exact" w:line="360"/>
-              <w:jc w:val="center"/>
-            </w:pPr>
-            <w:r>
-              <w:rPr>
-                <w:rFonts w:ascii="Times New Roman" w:hAnsi="Times New Roman" w:eastAsia="標楷體"/>
-                <w:b/>
-                <w:color w:val="282828"/>
-                <w:sz w:val="24"/>
-              </w:rPr>
-              <w:t>家屬</w:t>
-            </w:r>
-          </w:p>
+          <w:p/>
         </w:tc>
         <w:tc>
           <w:tcPr>
@@ -5387,6 +5489,7 @@
         <w:tc>
           <w:tcPr>
             <w:tcW w:type="dxa" w:w="1440"/>
+            <w:vMerge w:val="restart"/>
             <w:shd w:fill="FFFFFF"/>
             <w:tcMar>
               <w:top w:w="50" w:type="dxa"/>
@@ -5395,7 +5498,120 @@
               <w:right w:w="90" w:type="dxa"/>
             </w:tcMar>
             <w:vAlign w:val="center"/>
-          </w:tcPr>
+            <w:shd w:fill="F2F5F9"/>
+            <w:tcMar>
+              <w:top w:w="60" w:type="dxa"/>
+              <w:bottom w:w="60" w:type="dxa"/>
+              <w:left w:w="90" w:type="dxa"/>
+              <w:right w:w="90" w:type="dxa"/>
+            </w:tcMar>
+          </w:tcPr>
+          <w:p>
+            <w:pPr>
+              <w:spacing w:before="0" w:after="0" w:lineRule="exact" w:line="360"/>
+              <w:jc w:val="center"/>
+            </w:pPr>
+            <w:r/>
+            <w:r>
+              <w:rPr>
+                <w:rFonts w:ascii="Times New Roman" w:hAnsi="Times New Roman" w:eastAsia="標楷體"/>
+                <w:b/>
+                <w:color w:val="142850"/>
+                <w:sz w:val="24"/>
+              </w:rPr>
+              <w:t>開發者</w:t>
+            </w:r>
+          </w:p>
+          <w:p>
+            <w:pPr>
+              <w:spacing w:before="0" w:after="0" w:lineRule="exact" w:line="360"/>
+              <w:jc w:val="center"/>
+            </w:pPr>
+            <w:r>
+              <w:rPr>
+                <w:rFonts w:ascii="Times New Roman" w:hAnsi="Times New Roman" w:eastAsia="標楷體"/>
+                <w:b/>
+                <w:color w:val="282828"/>
+                <w:sz w:val="24"/>
+              </w:rPr>
+              <w:t>開發者</w:t>
+            </w:r>
+          </w:p>
+          <w:p>
+            <w:pPr>
+              <w:spacing w:before="0" w:after="0" w:lineRule="exact" w:line="360"/>
+              <w:jc w:val="center"/>
+            </w:pPr>
+            <w:r>
+              <w:rPr>
+                <w:rFonts w:ascii="Times New Roman" w:hAnsi="Times New Roman" w:eastAsia="標楷體"/>
+                <w:b/>
+                <w:color w:val="282828"/>
+                <w:sz w:val="24"/>
+              </w:rPr>
+              <w:t>開發者</w:t>
+            </w:r>
+          </w:p>
+          <w:p>
+            <w:pPr>
+              <w:spacing w:before="0" w:after="0" w:lineRule="exact" w:line="360"/>
+              <w:jc w:val="center"/>
+            </w:pPr>
+            <w:r>
+              <w:rPr>
+                <w:rFonts w:ascii="Times New Roman" w:hAnsi="Times New Roman" w:eastAsia="標楷體"/>
+                <w:b/>
+                <w:color w:val="282828"/>
+                <w:sz w:val="24"/>
+              </w:rPr>
+              <w:t>開發者</w:t>
+            </w:r>
+          </w:p>
+          <w:p>
+            <w:pPr>
+              <w:spacing w:before="0" w:after="0" w:lineRule="exact" w:line="360"/>
+              <w:jc w:val="center"/>
+            </w:pPr>
+            <w:r>
+              <w:rPr>
+                <w:rFonts w:ascii="Times New Roman" w:hAnsi="Times New Roman" w:eastAsia="標楷體"/>
+                <w:b/>
+                <w:color w:val="282828"/>
+                <w:sz w:val="24"/>
+              </w:rPr>
+              <w:t>開發者</w:t>
+            </w:r>
+          </w:p>
+          <w:p>
+            <w:pPr>
+              <w:spacing w:before="0" w:after="0" w:lineRule="exact" w:line="360"/>
+              <w:jc w:val="center"/>
+            </w:pPr>
+            <w:r>
+              <w:rPr>
+                <w:rFonts w:ascii="Times New Roman" w:hAnsi="Times New Roman" w:eastAsia="標楷體"/>
+                <w:b/>
+                <w:color w:val="282828"/>
+                <w:sz w:val="24"/>
+              </w:rPr>
+              <w:t>開發者</w:t>
+            </w:r>
+          </w:p>
+          <w:p>
+            <w:pPr>
+              <w:spacing w:before="0" w:after="0" w:lineRule="exact" w:line="360"/>
+              <w:jc w:val="center"/>
+            </w:pPr>
+            <w:r>
+              <w:rPr>
+                <w:rFonts w:ascii="Times New Roman" w:hAnsi="Times New Roman" w:eastAsia="標楷體"/>
+                <w:b/>
+                <w:color w:val="282828"/>
+                <w:sz w:val="24"/>
+              </w:rPr>
+              <w:t>開發者</w:t>
+            </w:r>
+          </w:p>
           <w:p>
             <w:pPr>
               <w:spacing w:before="0" w:after="0" w:lineRule="exact" w:line="360"/>
@@ -5504,6 +5720,7 @@
         <w:tc>
           <w:tcPr>
             <w:tcW w:type="dxa" w:w="1440"/>
+            <w:vMerge/>
             <w:shd w:fill="FAFAFA"/>
             <w:tcMar>
               <w:top w:w="50" w:type="dxa"/>
@@ -5513,21 +5730,7 @@
             </w:tcMar>
             <w:vAlign w:val="center"/>
           </w:tcPr>
-          <w:p>
-            <w:pPr>
-              <w:spacing w:before="0" w:after="0" w:lineRule="exact" w:line="360"/>
-              <w:jc w:val="center"/>
-            </w:pPr>
-            <w:r>
-              <w:rPr>
-                <w:rFonts w:ascii="Times New Roman" w:hAnsi="Times New Roman" w:eastAsia="標楷體"/>
-                <w:b/>
-                <w:color w:val="282828"/>
-                <w:sz w:val="24"/>
-              </w:rPr>
-              <w:t>開發者</w:t>
-            </w:r>
-          </w:p>
+          <w:p/>
         </w:tc>
         <w:tc>
           <w:tcPr>
@@ -5621,6 +5824,7 @@
         <w:tc>
           <w:tcPr>
             <w:tcW w:type="dxa" w:w="1440"/>
+            <w:vMerge/>
             <w:shd w:fill="FFFFFF"/>
             <w:tcMar>
               <w:top w:w="50" w:type="dxa"/>
@@ -5630,21 +5834,7 @@
             </w:tcMar>
             <w:vAlign w:val="center"/>
           </w:tcPr>
-          <w:p>
-            <w:pPr>
-              <w:spacing w:before="0" w:after="0" w:lineRule="exact" w:line="360"/>
-              <w:jc w:val="center"/>
-            </w:pPr>
-            <w:r>
-              <w:rPr>
-                <w:rFonts w:ascii="Times New Roman" w:hAnsi="Times New Roman" w:eastAsia="標楷體"/>
-                <w:b/>
-                <w:color w:val="282828"/>
-                <w:sz w:val="24"/>
-              </w:rPr>
-              <w:t>開發者</w:t>
-            </w:r>
-          </w:p>
+          <w:p/>
         </w:tc>
         <w:tc>
           <w:tcPr>
@@ -5738,6 +5928,7 @@
         <w:tc>
           <w:tcPr>
             <w:tcW w:type="dxa" w:w="1440"/>
+            <w:vMerge/>
             <w:shd w:fill="FAFAFA"/>
             <w:tcMar>
               <w:top w:w="50" w:type="dxa"/>
@@ -5747,21 +5938,7 @@
             </w:tcMar>
             <w:vAlign w:val="center"/>
           </w:tcPr>
-          <w:p>
-            <w:pPr>
-              <w:spacing w:before="0" w:after="0" w:lineRule="exact" w:line="360"/>
-              <w:jc w:val="center"/>
-            </w:pPr>
-            <w:r>
-              <w:rPr>
-                <w:rFonts w:ascii="Times New Roman" w:hAnsi="Times New Roman" w:eastAsia="標楷體"/>
-                <w:b/>
-                <w:color w:val="282828"/>
-                <w:sz w:val="24"/>
-              </w:rPr>
-              <w:t>開發者</w:t>
-            </w:r>
-          </w:p>
+          <w:p/>
         </w:tc>
         <w:tc>
           <w:tcPr>
@@ -5855,6 +6032,7 @@
         <w:tc>
           <w:tcPr>
             <w:tcW w:type="dxa" w:w="1440"/>
+            <w:vMerge/>
             <w:shd w:fill="FFFFFF"/>
             <w:tcMar>
               <w:top w:w="50" w:type="dxa"/>
@@ -5864,21 +6042,7 @@
             </w:tcMar>
             <w:vAlign w:val="center"/>
           </w:tcPr>
-          <w:p>
-            <w:pPr>
-              <w:spacing w:before="0" w:after="0" w:lineRule="exact" w:line="360"/>
-              <w:jc w:val="center"/>
-            </w:pPr>
-            <w:r>
-              <w:rPr>
-                <w:rFonts w:ascii="Times New Roman" w:hAnsi="Times New Roman" w:eastAsia="標楷體"/>
-                <w:b/>
-                <w:color w:val="282828"/>
-                <w:sz w:val="24"/>
-              </w:rPr>
-              <w:t>開發者</w:t>
-            </w:r>
-          </w:p>
+          <w:p/>
         </w:tc>
         <w:tc>
           <w:tcPr>
@@ -5972,6 +6136,7 @@
         <w:tc>
           <w:tcPr>
             <w:tcW w:type="dxa" w:w="1440"/>
+            <w:vMerge/>
             <w:shd w:fill="FAFAFA"/>
             <w:tcMar>
               <w:top w:w="50" w:type="dxa"/>
@@ -5981,21 +6146,7 @@
             </w:tcMar>
             <w:vAlign w:val="center"/>
           </w:tcPr>
-          <w:p>
-            <w:pPr>
-              <w:spacing w:before="0" w:after="0" w:lineRule="exact" w:line="360"/>
-              <w:jc w:val="center"/>
-            </w:pPr>
-            <w:r>
-              <w:rPr>
-                <w:rFonts w:ascii="Times New Roman" w:hAnsi="Times New Roman" w:eastAsia="標楷體"/>
-                <w:b/>
-                <w:color w:val="282828"/>
-                <w:sz w:val="24"/>
-              </w:rPr>
-              <w:t>開發者</w:t>
-            </w:r>
-          </w:p>
+          <w:p/>
         </w:tc>
         <w:tc>
           <w:tcPr>
@@ -6089,6 +6240,7 @@
         <w:tc>
           <w:tcPr>
             <w:tcW w:type="dxa" w:w="1440"/>
+            <w:vMerge/>
             <w:shd w:fill="FFFFFF"/>
             <w:tcMar>
               <w:top w:w="50" w:type="dxa"/>
@@ -6098,21 +6250,7 @@
             </w:tcMar>
             <w:vAlign w:val="center"/>
           </w:tcPr>
-          <w:p>
-            <w:pPr>
-              <w:spacing w:before="0" w:after="0" w:lineRule="exact" w:line="360"/>
-              <w:jc w:val="center"/>
-            </w:pPr>
-            <w:r>
-              <w:rPr>
-                <w:rFonts w:ascii="Times New Roman" w:hAnsi="Times New Roman" w:eastAsia="標楷體"/>
-                <w:b/>
-                <w:color w:val="282828"/>
-                <w:sz w:val="24"/>
-              </w:rPr>
-              <w:t>開發者</w:t>
-            </w:r>
-          </w:p>
+          <w:p/>
         </w:tc>
         <w:tc>
           <w:tcPr>
@@ -6206,6 +6344,7 @@
         <w:tc>
           <w:tcPr>
             <w:tcW w:type="dxa" w:w="1440"/>
+            <w:vMerge/>
             <w:shd w:fill="FAFAFA"/>
             <w:tcMar>
               <w:top w:w="50" w:type="dxa"/>
@@ -6215,21 +6354,7 @@
             </w:tcMar>
             <w:vAlign w:val="center"/>
           </w:tcPr>
-          <w:p>
-            <w:pPr>
-              <w:spacing w:before="0" w:after="0" w:lineRule="exact" w:line="360"/>
-              <w:jc w:val="center"/>
-            </w:pPr>
-            <w:r>
-              <w:rPr>
-                <w:rFonts w:ascii="Times New Roman" w:hAnsi="Times New Roman" w:eastAsia="標楷體"/>
-                <w:b/>
-                <w:color w:val="282828"/>
-                <w:sz w:val="24"/>
-              </w:rPr>
-              <w:t>開發者</w:t>
-            </w:r>
-          </w:p>
+          <w:p/>
         </w:tc>
         <w:tc>
           <w:tcPr>

</xml_diff>